<commit_message>
feat(courseware): replace Activity 7 with two RAG labs (7a + 7b) and add website screenshots
- Activity 7a (n8n-ragdemo): RAG chatbot — web PDF upload → in-memory vector
  store (Gemini embeddings) → Telegram Q&A on an IT-Support FAQ
- Activity 7b (n8n-ragdemo2): Cook & Bake Academy customer-support RAG agent —
  ingest 20 brochures from Drive into a vector DB (Supabase / Pinecone / Qdrant),
  answer via a website chat widget
- Add real n8n canvas screenshots for all 7a/7b workflows
- Capture website screenshots for activities 5, 6, 7a, 7b, 8 and the capstone;
  embed them in the slide deck and Learner Guide
- PPT bumped to v42 (versioned filename + cover); LP version 3.0, LG version 6.0
- LP/LG output filenames standardised to LP-/LG-<Course Title>
- Regenerate PPT, LP, LG (DOCX + PDF); rewrite stale README to current lineup

Co-Authored-By: Claude Opus 4.8 (1M context) <noreply@anthropic.com>
</commit_message>
<xml_diff>
--- a/courseware/LP-Agentic AI Automation with n8n.docx
+++ b/courseware/LP-Agentic AI Automation with n8n.docx
@@ -218,7 +218,7 @@
           <w:color w:val="1F6FEB"/>
           <w:sz w:val="24"/>
         </w:rPr>
-        <w:t>Version 2.0</w:t>
+        <w:t>Version 3.0</w:t>
       </w:r>
     </w:p>
     <w:p>
@@ -420,6 +420,64 @@
                 <w:sz w:val="19"/>
               </w:rPr>
               <w:t>Renumbered Day 2 activities: Investment Advisor → Activity 5, Finance Advisor → Activity 6, RAG → Activity 7; updated Activity 8 to the integrated HR Service Portal (Leave Approval, Dashboard Data, AI Chatbot with Guardrails)</w:t>
+            </w:r>
+          </w:p>
+        </w:tc>
+        <w:tc>
+          <w:tcPr>
+            <w:tcW w:type="dxa" w:w="2160"/>
+          </w:tcPr>
+          <w:p>
+            <w:r/>
+            <w:r>
+              <w:rPr>
+                <w:sz w:val="19"/>
+              </w:rPr>
+              <w:t>Tertiary Infotech Academy Pte Ltd</w:t>
+            </w:r>
+          </w:p>
+        </w:tc>
+      </w:tr>
+      <w:tr>
+        <w:tc>
+          <w:tcPr>
+            <w:tcW w:type="dxa" w:w="2160"/>
+          </w:tcPr>
+          <w:p>
+            <w:r/>
+            <w:r>
+              <w:rPr>
+                <w:sz w:val="19"/>
+              </w:rPr>
+              <w:t>3.0</w:t>
+            </w:r>
+          </w:p>
+        </w:tc>
+        <w:tc>
+          <w:tcPr>
+            <w:tcW w:type="dxa" w:w="2160"/>
+          </w:tcPr>
+          <w:p>
+            <w:r/>
+            <w:r>
+              <w:rPr>
+                <w:sz w:val="19"/>
+              </w:rPr>
+              <w:t>1 July 2026</w:t>
+            </w:r>
+          </w:p>
+        </w:tc>
+        <w:tc>
+          <w:tcPr>
+            <w:tcW w:type="dxa" w:w="2160"/>
+          </w:tcPr>
+          <w:p>
+            <w:r/>
+            <w:r>
+              <w:rPr>
+                <w:sz w:val="19"/>
+              </w:rPr>
+              <w:t>Replaced Activity 7 with two new RAG labs — Activity 7a (RAG chatbot: web PDF upload → vector store → Telegram Q&amp;A) and Activity 7b (customer-support RAG agent across three vector databases: Supabase, Pinecone, Qdrant)</w:t>
             </w:r>
           </w:p>
         </w:tc>
@@ -3403,7 +3461,7 @@
                 <w:i w:val="0"/>
                 <w:sz w:val="19"/>
               </w:rPr>
-              <w:t>Generate mock documents with Claude Code (e.g. employee-benefits FAQ, IT support FAQ, product info)</w:t>
+              <w:t>RAG ingestion walkthrough — the upload → embed → vector-store → retrieve loop; set up OpenAI / Gemini embedding credentials</w:t>
             </w:r>
           </w:p>
         </w:tc>
@@ -3459,7 +3517,7 @@
                 <w:i w:val="0"/>
                 <w:sz w:val="19"/>
               </w:rPr>
-              <w:t>Activity 7: Add RAG to the Telegram agent — route between RAG vector store and Data Table via the system instruction.  Extension — Activity 7b: RAG with Pinecone (persistent cloud vector database)</w:t>
+              <w:t>Activity 7a: RAG chatbot — upload an IT-Support FAQ PDF from a web page into a vector store, then ask the Telegram bot (Gemini embeddings + knowledge_base tool).  Activity 7b: customer-support RAG agent for a training center, ingesting 20 course brochures across three vector databases (Supabase pgvector, Pinecone, Qdrant) answering via a website chat widget</w:t>
             </w:r>
           </w:p>
         </w:tc>

</xml_diff>